<commit_message>
criação de modelo word
</commit_message>
<xml_diff>
--- a/api/_lib/templates/contrato.docx
+++ b/api/_lib/templates/contrato.docx
@@ -19,7 +19,7 @@
         <mc:AlternateContent>
           <mc:Choice Requires="wps">
             <w:drawing>
-              <wp:anchor distT="0" distB="0" distL="0" distR="0" simplePos="0" relativeHeight="487453184" behindDoc="1" locked="0" layoutInCell="1" allowOverlap="1" wp14:anchorId="69599AE8" wp14:editId="2D98B31D">
+              <wp:anchor distT="0" distB="0" distL="0" distR="0" simplePos="0" relativeHeight="487453184" behindDoc="1" locked="0" layoutInCell="1" allowOverlap="1" wp14:anchorId="69599AE8" wp14:editId="02390F5B">
                 <wp:simplePos x="0" y="0"/>
                 <wp:positionH relativeFrom="page">
                   <wp:posOffset>0</wp:posOffset>
@@ -90,7 +90,7 @@
           </mc:Choice>
           <mc:Fallback>
             <w:pict>
-              <v:shape w14:anchorId="69CF523E" id="Graphic 1" o:spid="_x0000_s1026" style="position:absolute;margin-left:0;margin-top:0;width:595.5pt;height:842.25pt;z-index:-15863296;visibility:visible;mso-wrap-style:square;mso-wrap-distance-left:0;mso-wrap-distance-top:0;mso-wrap-distance-right:0;mso-wrap-distance-bottom:0;mso-position-horizontal:absolute;mso-position-horizontal-relative:page;mso-position-vertical:absolute;mso-position-vertical-relative:page;v-text-anchor:top" coordsize="7562850,10696575" o:gfxdata="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" path="m7562849,10696574l,10696574,,,7562849,r,10696574xe" fillcolor="#b8ddf5" stroked="f">
+              <v:shape w14:anchorId="315DA276" id="Graphic 1" o:spid="_x0000_s1026" style="position:absolute;margin-left:0;margin-top:0;width:595.5pt;height:842.25pt;z-index:-15863296;visibility:visible;mso-wrap-style:square;mso-wrap-distance-left:0;mso-wrap-distance-top:0;mso-wrap-distance-right:0;mso-wrap-distance-bottom:0;mso-position-horizontal:absolute;mso-position-horizontal-relative:page;mso-position-vertical:absolute;mso-position-vertical-relative:page;v-text-anchor:top" coordsize="7562850,10696575" o:gfxdata="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" path="m7562849,10696574l,10696574,,,7562849,r,10696574xe" fillcolor="#b8ddf5" stroked="f">
                 <v:path arrowok="t"/>
                 <w10:wrap anchorx="page" anchory="page"/>
               </v:shape>
@@ -107,7 +107,7 @@
         <mc:AlternateContent>
           <mc:Choice Requires="wpg">
             <w:drawing>
-              <wp:anchor distT="0" distB="0" distL="0" distR="0" simplePos="0" relativeHeight="487453696" behindDoc="1" locked="0" layoutInCell="1" allowOverlap="1" wp14:anchorId="561C2A8A" wp14:editId="1198C328">
+              <wp:anchor distT="0" distB="0" distL="0" distR="0" simplePos="0" relativeHeight="487453696" behindDoc="1" locked="0" layoutInCell="1" allowOverlap="1" wp14:anchorId="561C2A8A" wp14:editId="51A95481">
                 <wp:simplePos x="0" y="0"/>
                 <wp:positionH relativeFrom="page">
                   <wp:posOffset>153300</wp:posOffset>
@@ -355,7 +355,7 @@
           </mc:Choice>
           <mc:Fallback>
             <w:pict>
-              <v:group w14:anchorId="5163D6C5" id="Group 2" o:spid="_x0000_s1026" style="position:absolute;margin-left:12.05pt;margin-top:12.05pt;width:571.4pt;height:818.1pt;z-index:-15862784;mso-wrap-distance-left:0;mso-wrap-distance-right:0;mso-position-horizontal-relative:page;mso-position-vertical-relative:page" coordsize="72567,103898" o:gfxdata="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">
+              <v:group w14:anchorId="7FEDB652" id="Group 2" o:spid="_x0000_s1026" style="position:absolute;margin-left:12.05pt;margin-top:12.05pt;width:571.4pt;height:818.1pt;z-index:-15862784;mso-wrap-distance-left:0;mso-wrap-distance-right:0;mso-position-horizontal-relative:page;mso-position-vertical-relative:page" coordsize="72567,103898" o:gfxdata="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">
                 <v:shape id="Graphic 3" o:spid="_x0000_s1027" style="position:absolute;width:72567;height:103898;visibility:visible;mso-wrap-style:square;v-text-anchor:top" coordsize="7256780,10389870" o:gfxdata="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" path="m6903690,10389427r-6551133,l306216,10386369r-45156,-9021l217639,10362590r-41139,-20268l138192,10316772r-34931,-30606l72655,10251235r-25551,-38309l26836,10171787r-14758,-43421l3057,10083211,,10036870,,352557,3057,306216r9021,-45156l26836,217639,47104,176500,72655,138192r30606,-34931l138192,72655,176500,47104,217639,26836,261060,12078,306216,3057,352557,,6903690,r46341,3057l6995186,12078r43421,14758l7079746,47104r38309,25551l7152985,103261r30607,34931l7209142,176500r20268,41139l7244168,261060r9021,45156l7256247,352557r,9684313l7253189,10083211r-9021,45155l7229410,10171787r-20268,41139l7183592,10251235r-30607,34931l7118055,10316772r-38309,25550l7038607,10362590r-43421,14758l6950031,10386369r-46341,3058xe" stroked="f">
                   <v:path arrowok="t"/>
                 </v:shape>
@@ -561,7 +561,6 @@
         <w:rPr>
           <w:rFonts w:ascii="Arial" w:hAnsi="Arial"/>
           <w:b/>
-          <w:color w:val="123A7C"/>
         </w:rPr>
         <w:t>N.</w:t>
       </w:r>
@@ -569,7 +568,6 @@
         <w:rPr>
           <w:rFonts w:ascii="Arial" w:hAnsi="Arial"/>
           <w:b/>
-          <w:color w:val="123A7C"/>
           <w:spacing w:val="33"/>
         </w:rPr>
         <w:t xml:space="preserve"> </w:t>
@@ -578,7 +576,6 @@
         <w:rPr>
           <w:rFonts w:ascii="Arial" w:hAnsi="Arial"/>
           <w:b/>
-          <w:color w:val="123A7C"/>
         </w:rPr>
         <w:t>{numero_contrato}</w:t>
       </w:r>
@@ -886,7 +883,6 @@
       <w:r>
         <w:rPr>
           <w:b/>
-          <w:color w:val="123A7C"/>
           <w:sz w:val="24"/>
         </w:rPr>
         <w:t>{nome_cliente}</w:t>
@@ -894,7 +890,6 @@
       <w:r>
         <w:rPr>
           <w:b/>
-          <w:color w:val="123A7C"/>
           <w:spacing w:val="51"/>
           <w:sz w:val="24"/>
         </w:rPr>
@@ -916,7 +911,6 @@
       <w:r>
         <w:rPr>
           <w:b/>
-          <w:color w:val="123A7C"/>
           <w:sz w:val="24"/>
         </w:rPr>
         <w:t>{profissao}</w:t>
@@ -924,7 +918,6 @@
       <w:r>
         <w:rPr>
           <w:b/>
-          <w:color w:val="123A7C"/>
           <w:spacing w:val="51"/>
           <w:sz w:val="24"/>
         </w:rPr>
@@ -954,7 +947,6 @@
       <w:r>
         <w:rPr>
           <w:b/>
-          <w:color w:val="123A7C"/>
           <w:sz w:val="24"/>
         </w:rPr>
         <w:t>{cpf}</w:t>
@@ -962,7 +954,6 @@
       <w:r>
         <w:rPr>
           <w:b/>
-          <w:color w:val="123A7C"/>
           <w:spacing w:val="-2"/>
           <w:sz w:val="24"/>
         </w:rPr>
@@ -984,7 +975,6 @@
       <w:r>
         <w:rPr>
           <w:b/>
-          <w:color w:val="123A7C"/>
           <w:sz w:val="24"/>
         </w:rPr>
         <w:t>{rg}</w:t>
@@ -992,7 +982,6 @@
       <w:r>
         <w:rPr>
           <w:b/>
-          <w:color w:val="123A7C"/>
           <w:spacing w:val="51"/>
           <w:sz w:val="24"/>
         </w:rPr>
@@ -1040,7 +1029,6 @@
       <w:r>
         <w:rPr>
           <w:b/>
-          <w:color w:val="123A7C"/>
           <w:sz w:val="24"/>
         </w:rPr>
         <w:t>{data_nascimento}</w:t>
@@ -1048,7 +1036,6 @@
       <w:r>
         <w:rPr>
           <w:b/>
-          <w:color w:val="123A7C"/>
           <w:spacing w:val="-7"/>
           <w:sz w:val="24"/>
         </w:rPr>
@@ -1070,7 +1057,6 @@
       <w:r>
         <w:rPr>
           <w:b/>
-          <w:color w:val="123A7C"/>
           <w:sz w:val="24"/>
         </w:rPr>
         <w:t>{endereco}</w:t>
@@ -1078,7 +1064,6 @@
       <w:r>
         <w:rPr>
           <w:b/>
-          <w:color w:val="123A7C"/>
           <w:sz w:val="24"/>
         </w:rPr>
         <w:t xml:space="preserve"> </w:t>
@@ -1092,7 +1077,6 @@
       <w:r>
         <w:rPr>
           <w:b/>
-          <w:color w:val="123A7C"/>
           <w:sz w:val="24"/>
         </w:rPr>
         <w:t>{telefone}</w:t>
@@ -1474,298 +1458,22 @@
     <w:p>
       <w:pPr>
         <w:spacing w:line="271" w:lineRule="auto"/>
-        <w:ind w:left="474" w:right="501" w:hanging="228"/>
-        <w:rPr>
-          <w:b/>
-          <w:sz w:val="24"/>
-        </w:rPr>
-      </w:pPr>
-      <w:r>
-        <w:rPr>
-          <w:noProof/>
-          <w:position w:val="3"/>
-        </w:rPr>
-        <w:drawing>
-          <wp:inline distT="0" distB="0" distL="0" distR="0" wp14:anchorId="040E3304" wp14:editId="2FC7D368">
-            <wp:extent cx="38114" cy="38114"/>
-            <wp:effectExtent l="0" t="0" r="0" b="0"/>
-            <wp:docPr id="6" name="Image 6"/>
-            <wp:cNvGraphicFramePr>
-              <a:graphicFrameLocks xmlns:a="http://schemas.openxmlformats.org/drawingml/2006/main"/>
-            </wp:cNvGraphicFramePr>
-            <a:graphic xmlns:a="http://schemas.openxmlformats.org/drawingml/2006/main">
-              <a:graphicData uri="http://schemas.openxmlformats.org/drawingml/2006/picture">
-                <pic:pic xmlns:pic="http://schemas.openxmlformats.org/drawingml/2006/picture">
-                  <pic:nvPicPr>
-                    <pic:cNvPr id="6" name="Image 6"/>
-                    <pic:cNvPicPr/>
-                  </pic:nvPicPr>
-                  <pic:blipFill>
-                    <a:blip r:embed="rId8" cstate="print"/>
-                    <a:stretch>
-                      <a:fillRect/>
-                    </a:stretch>
-                  </pic:blipFill>
-                  <pic:spPr>
-                    <a:xfrm>
-                      <a:off x="0" y="0"/>
-                      <a:ext cx="38114" cy="38114"/>
-                    </a:xfrm>
-                    <a:prstGeom prst="rect">
-                      <a:avLst/>
-                    </a:prstGeom>
-                  </pic:spPr>
-                </pic:pic>
-              </a:graphicData>
-            </a:graphic>
-          </wp:inline>
-        </w:drawing>
-      </w:r>
-      <w:r>
-        <w:rPr>
-          <w:rFonts w:ascii="Times New Roman" w:hAnsi="Times New Roman"/>
-          <w:spacing w:val="80"/>
-          <w:sz w:val="20"/>
-        </w:rPr>
-        <w:t xml:space="preserve"> </w:t>
-      </w:r>
-      <w:r>
-        <w:rPr>
-          <w:sz w:val="24"/>
-        </w:rPr>
-        <w:t xml:space="preserve">Produto 1: </w:t>
-      </w:r>
-      <w:r>
-        <w:rPr>
-          <w:b/>
-          <w:color w:val="123A7C"/>
-          <w:sz w:val="24"/>
-        </w:rPr>
-        <w:t xml:space="preserve">{produto_categoria} </w:t>
-      </w:r>
-      <w:r>
-        <w:rPr>
-          <w:sz w:val="24"/>
-        </w:rPr>
-        <w:t xml:space="preserve">Marca/Modelo: </w:t>
-      </w:r>
-      <w:r>
-        <w:rPr>
-          <w:b/>
-          <w:color w:val="123A7C"/>
-          <w:sz w:val="24"/>
-        </w:rPr>
-        <w:t>{produto_modelo}</w:t>
-      </w:r>
-      <w:r>
-        <w:rPr>
-          <w:b/>
-          <w:color w:val="123A7C"/>
-          <w:sz w:val="24"/>
-        </w:rPr>
-        <w:t xml:space="preserve">; </w:t>
-      </w:r>
-      <w:r>
-        <w:rPr>
-          <w:sz w:val="24"/>
-        </w:rPr>
-        <w:t xml:space="preserve">Cor: </w:t>
-      </w:r>
-      <w:r>
-        <w:rPr>
-          <w:b/>
-          <w:color w:val="123A7C"/>
-          <w:sz w:val="24"/>
-        </w:rPr>
-        <w:t xml:space="preserve">{produto_cor}; </w:t>
-      </w:r>
-      <w:r>
-        <w:rPr>
-          <w:sz w:val="24"/>
-        </w:rPr>
-        <w:t>Número</w:t>
-      </w:r>
-      <w:r>
-        <w:rPr>
-          <w:spacing w:val="-5"/>
-          <w:sz w:val="24"/>
-        </w:rPr>
-        <w:t xml:space="preserve"> </w:t>
-      </w:r>
-      <w:r>
-        <w:rPr>
-          <w:sz w:val="24"/>
-        </w:rPr>
-        <w:t>de</w:t>
-      </w:r>
-      <w:r>
-        <w:rPr>
-          <w:spacing w:val="-5"/>
-          <w:sz w:val="24"/>
-        </w:rPr>
-        <w:t xml:space="preserve"> </w:t>
-      </w:r>
-      <w:r>
-        <w:rPr>
-          <w:sz w:val="24"/>
-        </w:rPr>
-        <w:t>Série:</w:t>
-      </w:r>
-      <w:r>
-        <w:rPr>
-          <w:spacing w:val="-5"/>
-          <w:sz w:val="24"/>
-        </w:rPr>
-        <w:t xml:space="preserve"> </w:t>
-      </w:r>
-      <w:r>
-        <w:rPr>
-          <w:b/>
-          <w:color w:val="123A7C"/>
-          <w:sz w:val="24"/>
-        </w:rPr>
-        <w:t>{produto_serie}</w:t>
-      </w:r>
-      <w:r>
-        <w:rPr>
-          <w:b/>
-          <w:color w:val="123A7C"/>
-          <w:spacing w:val="-5"/>
-          <w:sz w:val="24"/>
-        </w:rPr>
-        <w:t xml:space="preserve"> </w:t>
-      </w:r>
-      <w:r>
-        <w:rPr>
-          <w:b/>
-          <w:sz w:val="24"/>
-        </w:rPr>
-        <w:t>;</w:t>
-      </w:r>
-      <w:r>
-        <w:rPr>
-          <w:b/>
-          <w:spacing w:val="-5"/>
-          <w:sz w:val="24"/>
-        </w:rPr>
-        <w:t xml:space="preserve"> </w:t>
-      </w:r>
-      <w:r>
-        <w:rPr>
-          <w:sz w:val="24"/>
-        </w:rPr>
-        <w:t>IMEI:</w:t>
-      </w:r>
-      <w:r>
-        <w:rPr>
-          <w:spacing w:val="-5"/>
-          <w:sz w:val="24"/>
-        </w:rPr>
-        <w:t xml:space="preserve"> </w:t>
-      </w:r>
-      <w:r>
-        <w:rPr>
-          <w:b/>
-          <w:color w:val="123A7C"/>
-          <w:sz w:val="24"/>
-        </w:rPr>
-        <w:t>{produto_imei}</w:t>
-      </w:r>
-      <w:r>
-        <w:rPr>
-          <w:b/>
-          <w:color w:val="123A7C"/>
-          <w:sz w:val="24"/>
-        </w:rPr>
-        <w:t xml:space="preserve"> </w:t>
-      </w:r>
-      <w:r>
-        <w:rPr>
-          <w:sz w:val="24"/>
-        </w:rPr>
-        <w:t>Estado</w:t>
-      </w:r>
-      <w:r>
-        <w:rPr>
-          <w:spacing w:val="-5"/>
-          <w:sz w:val="24"/>
-        </w:rPr>
-        <w:t xml:space="preserve"> </w:t>
-      </w:r>
-      <w:r>
-        <w:rPr>
-          <w:sz w:val="24"/>
-        </w:rPr>
-        <w:t>do</w:t>
-      </w:r>
-      <w:r>
-        <w:rPr>
-          <w:spacing w:val="-5"/>
-          <w:sz w:val="24"/>
-        </w:rPr>
-        <w:t xml:space="preserve"> </w:t>
-      </w:r>
-      <w:r>
-        <w:rPr>
-          <w:sz w:val="24"/>
-        </w:rPr>
-        <w:t>Bem</w:t>
-      </w:r>
-      <w:r>
-        <w:rPr>
-          <w:spacing w:val="-5"/>
-          <w:sz w:val="24"/>
-        </w:rPr>
-        <w:t xml:space="preserve"> </w:t>
-      </w:r>
-      <w:r>
-        <w:rPr>
-          <w:sz w:val="24"/>
-        </w:rPr>
-        <w:t>(novo/usado):</w:t>
-      </w:r>
-      <w:r>
-        <w:rPr>
-          <w:spacing w:val="-5"/>
-          <w:sz w:val="24"/>
-        </w:rPr>
-        <w:t xml:space="preserve"> </w:t>
-      </w:r>
-      <w:r>
-        <w:rPr>
-          <w:b/>
-          <w:color w:val="123A7C"/>
-          <w:sz w:val="24"/>
-        </w:rPr>
-        <w:t>{produto_estado}</w:t>
-      </w:r>
-      <w:r>
-        <w:rPr>
-          <w:b/>
-          <w:sz w:val="24"/>
-        </w:rPr>
-        <w:t xml:space="preserve">; </w:t>
-      </w:r>
-      <w:r>
-        <w:rPr>
-          <w:sz w:val="24"/>
-        </w:rPr>
-        <w:t xml:space="preserve">Acessórios Inclusos: </w:t>
-      </w:r>
-      <w:r>
-        <w:rPr>
-          <w:b/>
-          <w:color w:val="123A7C"/>
-          <w:sz w:val="24"/>
-        </w:rPr>
-        <w:t>{produto_acessorios}</w:t>
+        <w:ind w:right="501"/>
+        <w:rPr>
+          <w:sz w:val="24"/>
+        </w:rPr>
+      </w:pPr>
+      <w:r>
+        <w:rPr>
+          <w:sz w:val="24"/>
+        </w:rPr>
+        <w:t>{produtos_lista}</w:t>
       </w:r>
     </w:p>
     <w:p>
       <w:pPr>
-        <w:pStyle w:val="Corpodetexto"/>
-        <w:spacing w:before="34"/>
-        <w:ind w:left="0"/>
+        <w:spacing w:line="271" w:lineRule="auto"/>
+        <w:ind w:left="474" w:right="501" w:hanging="228"/>
         <w:rPr>
           <w:b/>
         </w:rPr>
@@ -2138,13 +1846,7 @@
         <w:rPr>
           <w:sz w:val="24"/>
         </w:rPr>
-        <w:t>ven</w:t>
-      </w:r>
-      <w:r>
-        <w:rPr>
-          <w:sz w:val="24"/>
-        </w:rPr>
-        <w:t>da</w:t>
+        <w:t>venda</w:t>
       </w:r>
       <w:r>
         <w:rPr>
@@ -2247,7 +1949,6 @@
       <w:r>
         <w:rPr>
           <w:b/>
-          <w:color w:val="123A7C"/>
           <w:sz w:val="24"/>
         </w:rPr>
         <w:t>R$</w:t>
@@ -2255,7 +1956,6 @@
       <w:r>
         <w:rPr>
           <w:b/>
-          <w:color w:val="123A7C"/>
           <w:spacing w:val="-5"/>
           <w:sz w:val="24"/>
         </w:rPr>
@@ -2264,7 +1964,6 @@
       <w:r>
         <w:rPr>
           <w:b/>
-          <w:color w:val="123A7C"/>
           <w:sz w:val="24"/>
         </w:rPr>
         <w:t>{valor_total}</w:t>
@@ -2272,7 +1971,6 @@
       <w:r>
         <w:rPr>
           <w:b/>
-          <w:color w:val="123A7C"/>
           <w:spacing w:val="-5"/>
           <w:sz w:val="24"/>
         </w:rPr>
@@ -2281,7 +1979,6 @@
       <w:r>
         <w:rPr>
           <w:b/>
-          <w:color w:val="123A7C"/>
           <w:sz w:val="24"/>
         </w:rPr>
         <w:t>{valor_total_extenso}</w:t>
@@ -2289,7 +1986,6 @@
       <w:r>
         <w:rPr>
           <w:b/>
-          <w:color w:val="123A7C"/>
           <w:spacing w:val="-5"/>
           <w:sz w:val="24"/>
         </w:rPr>
@@ -2376,7 +2072,6 @@
       <w:r>
         <w:rPr>
           <w:b/>
-          <w:color w:val="123A7C"/>
           <w:sz w:val="24"/>
         </w:rPr>
         <w:t>{num_parcelas}</w:t>
@@ -2384,7 +2079,6 @@
       <w:r>
         <w:rPr>
           <w:b/>
-          <w:color w:val="123A7C"/>
           <w:spacing w:val="-5"/>
           <w:sz w:val="24"/>
         </w:rPr>
@@ -2438,7 +2132,6 @@
       <w:r>
         <w:rPr>
           <w:b/>
-          <w:color w:val="123A7C"/>
           <w:sz w:val="24"/>
         </w:rPr>
         <w:t xml:space="preserve">{valor_parcela} ({valor_parcela_extenso}) </w:t>
@@ -2452,7 +2145,6 @@
       <w:r>
         <w:rPr>
           <w:b/>
-          <w:color w:val="123A7C"/>
           <w:sz w:val="24"/>
         </w:rPr>
         <w:t xml:space="preserve">{primeiro_vencimento} </w:t>
@@ -2653,13 +2345,7 @@
         <w:rPr>
           <w:sz w:val="24"/>
         </w:rPr>
-        <w:t>boleto, conforme instruções f</w:t>
-      </w:r>
-      <w:r>
-        <w:rPr>
-          <w:sz w:val="24"/>
-        </w:rPr>
-        <w:t>ornecidas pela VENDEDORA.</w:t>
+        <w:t>boleto, conforme instruções fornecidas pela VENDEDORA.</w:t>
       </w:r>
     </w:p>
     <w:p>
@@ -2917,7 +2603,7 @@
         <mc:AlternateContent>
           <mc:Choice Requires="wps">
             <w:drawing>
-              <wp:anchor distT="0" distB="0" distL="0" distR="0" simplePos="0" relativeHeight="15730176" behindDoc="0" locked="0" layoutInCell="1" allowOverlap="1" wp14:anchorId="2006040A" wp14:editId="21D5C382">
+              <wp:anchor distT="0" distB="0" distL="0" distR="0" simplePos="0" relativeHeight="251654656" behindDoc="0" locked="0" layoutInCell="1" allowOverlap="1" wp14:anchorId="2006040A" wp14:editId="21D5C382">
                 <wp:simplePos x="0" y="0"/>
                 <wp:positionH relativeFrom="page">
                   <wp:posOffset>605863</wp:posOffset>
@@ -3003,7 +2689,7 @@
           </mc:Choice>
           <mc:Fallback>
             <w:pict>
-              <v:shape w14:anchorId="7FC8554E" id="Graphic 7" o:spid="_x0000_s1026" style="position:absolute;margin-left:47.7pt;margin-top:6.55pt;width:3.05pt;height:3.05pt;z-index:15730176;visibility:visible;mso-wrap-style:square;mso-wrap-distance-left:0;mso-wrap-distance-top:0;mso-wrap-distance-right:0;mso-wrap-distance-bottom:0;mso-position-horizontal:absolute;mso-position-horizontal-relative:page;mso-position-vertical:absolute;mso-position-vertical-relative:text;v-text-anchor:top" coordsize="38735,38735" o:gfxdata="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" path="m21584,38113r-5054,l14099,37629,,21584,,16529,16530,r5054,l38114,19057r,2527l21584,38113xe" fillcolor="black" stroked="f">
+              <v:shape w14:anchorId="215BD57A" id="Graphic 7" o:spid="_x0000_s1026" style="position:absolute;margin-left:47.7pt;margin-top:6.55pt;width:3.05pt;height:3.05pt;z-index:251654656;visibility:visible;mso-wrap-style:square;mso-wrap-distance-left:0;mso-wrap-distance-top:0;mso-wrap-distance-right:0;mso-wrap-distance-bottom:0;mso-position-horizontal:absolute;mso-position-horizontal-relative:page;mso-position-vertical:absolute;mso-position-vertical-relative:text;v-text-anchor:top" coordsize="38735,38735" o:gfxdata="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" path="m21584,38113r-5054,l14099,37629,,21584,,16529,16530,r5054,l38114,19057r,2527l21584,38113xe" fillcolor="black" stroked="f">
                 <v:path arrowok="t"/>
                 <w10:wrap anchorx="page"/>
               </v:shape>
@@ -3205,7 +2891,7 @@
         <mc:AlternateContent>
           <mc:Choice Requires="wps">
             <w:drawing>
-              <wp:anchor distT="0" distB="0" distL="0" distR="0" simplePos="0" relativeHeight="15730688" behindDoc="0" locked="0" layoutInCell="1" allowOverlap="1" wp14:anchorId="20BA1DD5" wp14:editId="1F17326C">
+              <wp:anchor distT="0" distB="0" distL="0" distR="0" simplePos="0" relativeHeight="251656704" behindDoc="0" locked="0" layoutInCell="1" allowOverlap="1" wp14:anchorId="20BA1DD5" wp14:editId="1F17326C">
                 <wp:simplePos x="0" y="0"/>
                 <wp:positionH relativeFrom="page">
                   <wp:posOffset>605863</wp:posOffset>
@@ -3291,7 +2977,7 @@
           </mc:Choice>
           <mc:Fallback>
             <w:pict>
-              <v:shape w14:anchorId="151909CD" id="Graphic 8" o:spid="_x0000_s1026" style="position:absolute;margin-left:47.7pt;margin-top:8.5pt;width:3.05pt;height:3.05pt;z-index:15730688;visibility:visible;mso-wrap-style:square;mso-wrap-distance-left:0;mso-wrap-distance-top:0;mso-wrap-distance-right:0;mso-wrap-distance-bottom:0;mso-position-horizontal:absolute;mso-position-horizontal-relative:page;mso-position-vertical:absolute;mso-position-vertical-relative:text;v-text-anchor:top" coordsize="38735,38735" o:gfxdata="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" path="m21584,38113r-5054,l14099,37629,,21583,,16529,16530,r5054,l38114,19057r,2526l21584,38113xe" fillcolor="black" stroked="f">
+              <v:shape w14:anchorId="345D41C0" id="Graphic 8" o:spid="_x0000_s1026" style="position:absolute;margin-left:47.7pt;margin-top:8.5pt;width:3.05pt;height:3.05pt;z-index:251656704;visibility:visible;mso-wrap-style:square;mso-wrap-distance-left:0;mso-wrap-distance-top:0;mso-wrap-distance-right:0;mso-wrap-distance-bottom:0;mso-position-horizontal:absolute;mso-position-horizontal-relative:page;mso-position-vertical:absolute;mso-position-vertical-relative:text;v-text-anchor:top" coordsize="38735,38735" o:gfxdata="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" path="m21584,38113r-5054,l14099,37629,,21583,,16529,16530,r5054,l38114,19057r,2526l21584,38113xe" fillcolor="black" stroked="f">
                 <v:path arrowok="t"/>
                 <w10:wrap anchorx="page"/>
               </v:shape>
@@ -3448,7 +3134,7 @@
         <mc:AlternateContent>
           <mc:Choice Requires="wps">
             <w:drawing>
-              <wp:anchor distT="0" distB="0" distL="0" distR="0" simplePos="0" relativeHeight="15731200" behindDoc="0" locked="0" layoutInCell="1" allowOverlap="1" wp14:anchorId="57F61BFF" wp14:editId="179CD969">
+              <wp:anchor distT="0" distB="0" distL="0" distR="0" simplePos="0" relativeHeight="251658752" behindDoc="0" locked="0" layoutInCell="1" allowOverlap="1" wp14:anchorId="57F61BFF" wp14:editId="179CD969">
                 <wp:simplePos x="0" y="0"/>
                 <wp:positionH relativeFrom="page">
                   <wp:posOffset>605863</wp:posOffset>
@@ -3534,7 +3220,7 @@
           </mc:Choice>
           <mc:Fallback>
             <w:pict>
-              <v:shape w14:anchorId="5D747EC9" id="Graphic 9" o:spid="_x0000_s1026" style="position:absolute;margin-left:47.7pt;margin-top:8.8pt;width:3.05pt;height:3.05pt;z-index:15731200;visibility:visible;mso-wrap-style:square;mso-wrap-distance-left:0;mso-wrap-distance-top:0;mso-wrap-distance-right:0;mso-wrap-distance-bottom:0;mso-position-horizontal:absolute;mso-position-horizontal-relative:page;mso-position-vertical:absolute;mso-position-vertical-relative:text;v-text-anchor:top" coordsize="38735,38735" o:gfxdata="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" path="m21584,38113r-5054,l14099,37630,,21584,,16529,16530,r5054,l38114,19057r,2527l21584,38113xe" fillcolor="black" stroked="f">
+              <v:shape w14:anchorId="12ED87D4" id="Graphic 9" o:spid="_x0000_s1026" style="position:absolute;margin-left:47.7pt;margin-top:8.8pt;width:3.05pt;height:3.05pt;z-index:251658752;visibility:visible;mso-wrap-style:square;mso-wrap-distance-left:0;mso-wrap-distance-top:0;mso-wrap-distance-right:0;mso-wrap-distance-bottom:0;mso-position-horizontal:absolute;mso-position-horizontal-relative:page;mso-position-vertical:absolute;mso-position-vertical-relative:text;v-text-anchor:top" coordsize="38735,38735" o:gfxdata="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" path="m21584,38113r-5054,l14099,37630,,21584,,16529,16530,r5054,l38114,19057r,2527l21584,38113xe" fillcolor="black" stroked="f">
                 <v:path arrowok="t"/>
                 <w10:wrap anchorx="page"/>
               </v:shape>
@@ -3717,7 +3403,7 @@
         <mc:AlternateContent>
           <mc:Choice Requires="wps">
             <w:drawing>
-              <wp:anchor distT="0" distB="0" distL="0" distR="0" simplePos="0" relativeHeight="15731712" behindDoc="0" locked="0" layoutInCell="1" allowOverlap="1" wp14:anchorId="774D4777" wp14:editId="6ABB9484">
+              <wp:anchor distT="0" distB="0" distL="0" distR="0" simplePos="0" relativeHeight="251660800" behindDoc="0" locked="0" layoutInCell="1" allowOverlap="1" wp14:anchorId="774D4777" wp14:editId="6ABB9484">
                 <wp:simplePos x="0" y="0"/>
                 <wp:positionH relativeFrom="page">
                   <wp:posOffset>605863</wp:posOffset>
@@ -3803,7 +3489,7 @@
           </mc:Choice>
           <mc:Fallback>
             <w:pict>
-              <v:shape w14:anchorId="6D5494CE" id="Graphic 10" o:spid="_x0000_s1026" style="position:absolute;margin-left:47.7pt;margin-top:8.8pt;width:3.05pt;height:3.05pt;z-index:15731712;visibility:visible;mso-wrap-style:square;mso-wrap-distance-left:0;mso-wrap-distance-top:0;mso-wrap-distance-right:0;mso-wrap-distance-bottom:0;mso-position-horizontal:absolute;mso-position-horizontal-relative:page;mso-position-vertical:absolute;mso-position-vertical-relative:text;v-text-anchor:top" coordsize="38735,38735" o:gfxdata="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" path="m21584,38113r-5054,l14099,37629,,21583,,16529,16530,r5054,l38114,19057r,2526l21584,38113xe" fillcolor="black" stroked="f">
+              <v:shape w14:anchorId="1E97A974" id="Graphic 10" o:spid="_x0000_s1026" style="position:absolute;margin-left:47.7pt;margin-top:8.8pt;width:3.05pt;height:3.05pt;z-index:251660800;visibility:visible;mso-wrap-style:square;mso-wrap-distance-left:0;mso-wrap-distance-top:0;mso-wrap-distance-right:0;mso-wrap-distance-bottom:0;mso-position-horizontal:absolute;mso-position-horizontal-relative:page;mso-position-vertical:absolute;mso-position-vertical-relative:text;v-text-anchor:top" coordsize="38735,38735" o:gfxdata="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" path="m21584,38113r-5054,l14099,37629,,21583,,16529,16530,r5054,l38114,19057r,2526l21584,38113xe" fillcolor="black" stroked="f">
                 <v:path arrowok="t"/>
                 <w10:wrap anchorx="page"/>
               </v:shape>
@@ -3979,7 +3665,7 @@
                     <pic:cNvPicPr/>
                   </pic:nvPicPr>
                   <pic:blipFill>
-                    <a:blip r:embed="rId9" cstate="print"/>
+                    <a:blip r:embed="rId8" cstate="print"/>
                     <a:stretch>
                       <a:fillRect/>
                     </a:stretch>
@@ -4110,7 +3796,7 @@
           </mc:Choice>
           <mc:Fallback>
             <w:pict>
-              <v:shape w14:anchorId="2C47D24C" id="Graphic 12" o:spid="_x0000_s1026" style="position:absolute;margin-left:0;margin-top:0;width:595.5pt;height:842.25pt;z-index:-15859712;visibility:visible;mso-wrap-style:square;mso-wrap-distance-left:0;mso-wrap-distance-top:0;mso-wrap-distance-right:0;mso-wrap-distance-bottom:0;mso-position-horizontal:absolute;mso-position-horizontal-relative:page;mso-position-vertical:absolute;mso-position-vertical-relative:page;v-text-anchor:top" coordsize="7562850,10696575" o:gfxdata="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" path="m7562849,10696574l,10696574,,,7562849,r,10696574xe" fillcolor="#b8ddf5" stroked="f">
+              <v:shape w14:anchorId="7EDB4B80" id="Graphic 12" o:spid="_x0000_s1026" style="position:absolute;margin-left:0;margin-top:0;width:595.5pt;height:842.25pt;z-index:-15859712;visibility:visible;mso-wrap-style:square;mso-wrap-distance-left:0;mso-wrap-distance-top:0;mso-wrap-distance-right:0;mso-wrap-distance-bottom:0;mso-position-horizontal:absolute;mso-position-horizontal-relative:page;mso-position-vertical:absolute;mso-position-vertical-relative:page;v-text-anchor:top" coordsize="7562850,10696575" o:gfxdata="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" path="m7562849,10696574l,10696574,,,7562849,r,10696574xe" fillcolor="#b8ddf5" stroked="f">
                 <v:path arrowok="t"/>
                 <w10:wrap anchorx="page" anchory="page"/>
               </v:shape>
@@ -4374,7 +4060,7 @@
           </mc:Choice>
           <mc:Fallback>
             <w:pict>
-              <v:group w14:anchorId="3AF82B15" id="Group 13" o:spid="_x0000_s1026" style="position:absolute;margin-left:12.05pt;margin-top:12.05pt;width:571.4pt;height:818.1pt;z-index:-15859200;mso-wrap-distance-left:0;mso-wrap-distance-right:0;mso-position-horizontal-relative:page;mso-position-vertical-relative:page" coordsize="72567,103898" o:gfxdata="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">
+              <v:group w14:anchorId="2C53912F" id="Group 13" o:spid="_x0000_s1026" style="position:absolute;margin-left:12.05pt;margin-top:12.05pt;width:571.4pt;height:818.1pt;z-index:-15859200;mso-wrap-distance-left:0;mso-wrap-distance-right:0;mso-position-horizontal-relative:page;mso-position-vertical-relative:page" coordsize="72567,103898" o:gfxdata="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">
                 <v:shape id="Graphic 14" o:spid="_x0000_s1027" style="position:absolute;width:72567;height:103898;visibility:visible;mso-wrap-style:square;v-text-anchor:top" coordsize="7256780,10389870" o:gfxdata="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" path="m6903690,10389427r-6551133,l306216,10386369r-45156,-9021l217639,10362590r-41139,-20268l138192,10316772r-34931,-30606l72655,10251235r-25551,-38309l26836,10171787r-14758,-43421l3057,10083211,,10036870,,352557,3057,306216r9021,-45156l26836,217639,47104,176500,72655,138192r30606,-34931l138192,72655,176500,47104,217639,26836,261060,12078,306216,3057,352557,,6903690,r46341,3057l6995186,12078r43421,14758l7079746,47104r38309,25551l7152985,103261r30607,34931l7209142,176500r20268,41139l7244168,261060r9021,45156l7256247,352557r,9684313l7253189,10083211r-9021,45155l7229410,10171787r-20268,41139l7183592,10251235r-30607,34931l7118055,10316772r-38309,25550l7038607,10362590r-43421,14758l6950031,10386369r-46341,3058xe" stroked="f">
                   <v:path arrowok="t"/>
                 </v:shape>
@@ -4932,13 +4618,7 @@
         <w:rPr>
           <w:sz w:val="24"/>
         </w:rPr>
-        <w:t>COMPRADOR(A</w:t>
-      </w:r>
-      <w:r>
-        <w:rPr>
-          <w:sz w:val="24"/>
-        </w:rPr>
-        <w:t>)</w:t>
+        <w:t>COMPRADOR(A)</w:t>
       </w:r>
       <w:r>
         <w:rPr>
@@ -5416,13 +5096,7 @@
         <w:rPr>
           <w:sz w:val="24"/>
         </w:rPr>
-        <w:t>inclusive bloqueio de ativação (como iCloud ou similares), denúncia indevida de “perda/roubo”, remoção de identificação, ocultação ou negativa de informar a localização</w:t>
-      </w:r>
-      <w:r>
-        <w:rPr>
-          <w:sz w:val="24"/>
-        </w:rPr>
-        <w:t xml:space="preserve">, caracterizará infração contratual grave, </w:t>
+        <w:t xml:space="preserve">inclusive bloqueio de ativação (como iCloud ou similares), denúncia indevida de “perda/roubo”, remoção de identificação, ocultação ou negativa de informar a localização, caracterizará infração contratual grave, </w:t>
       </w:r>
       <w:r>
         <w:rPr>
@@ -5445,7 +5119,7 @@
         <mc:AlternateContent>
           <mc:Choice Requires="wps">
             <w:drawing>
-              <wp:anchor distT="0" distB="0" distL="0" distR="0" simplePos="0" relativeHeight="15733760" behindDoc="0" locked="0" layoutInCell="1" allowOverlap="1" wp14:anchorId="619A30BC" wp14:editId="734C9860">
+              <wp:anchor distT="0" distB="0" distL="0" distR="0" simplePos="0" relativeHeight="251661824" behindDoc="0" locked="0" layoutInCell="1" allowOverlap="1" wp14:anchorId="619A30BC" wp14:editId="734C9860">
                 <wp:simplePos x="0" y="0"/>
                 <wp:positionH relativeFrom="page">
                   <wp:posOffset>612528</wp:posOffset>
@@ -5531,7 +5205,7 @@
           </mc:Choice>
           <mc:Fallback>
             <w:pict>
-              <v:shape w14:anchorId="5217A669" id="Graphic 16" o:spid="_x0000_s1026" style="position:absolute;margin-left:48.25pt;margin-top:6.45pt;width:3.05pt;height:3.05pt;z-index:15733760;visibility:visible;mso-wrap-style:square;mso-wrap-distance-left:0;mso-wrap-distance-top:0;mso-wrap-distance-right:0;mso-wrap-distance-bottom:0;mso-position-horizontal:absolute;mso-position-horizontal-relative:page;mso-position-vertical:absolute;mso-position-vertical-relative:text;v-text-anchor:top" coordsize="38735,38735" o:gfxdata="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" path="m21584,38114r-5054,l14099,37630,,21584,,16529,16530,r5054,l38114,19057r,2527l21584,38114xe" fillcolor="black" stroked="f">
+              <v:shape w14:anchorId="7EF40433" id="Graphic 16" o:spid="_x0000_s1026" style="position:absolute;margin-left:48.25pt;margin-top:6.45pt;width:3.05pt;height:3.05pt;z-index:251661824;visibility:visible;mso-wrap-style:square;mso-wrap-distance-left:0;mso-wrap-distance-top:0;mso-wrap-distance-right:0;mso-wrap-distance-bottom:0;mso-position-horizontal:absolute;mso-position-horizontal-relative:page;mso-position-vertical:absolute;mso-position-vertical-relative:text;v-text-anchor:top" coordsize="38735,38735" o:gfxdata="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" path="m21584,38114r-5054,l14099,37630,,21584,,16529,16530,r5054,l38114,19057r,2527l21584,38114xe" fillcolor="black" stroked="f">
                 <v:path arrowok="t"/>
                 <w10:wrap anchorx="page"/>
               </v:shape>
@@ -6084,13 +5758,7 @@
         <w:rPr>
           <w:sz w:val="24"/>
         </w:rPr>
-        <w:t>comunicar imediatamente a VENDEDORA e apresentar boletim</w:t>
-      </w:r>
-      <w:r>
-        <w:rPr>
-          <w:sz w:val="24"/>
-        </w:rPr>
-        <w:t xml:space="preserve"> de ocorrência quando aplicável.</w:t>
+        <w:t>comunicar imediatamente a VENDEDORA e apresentar boletim de ocorrência quando aplicável.</w:t>
       </w:r>
     </w:p>
     <w:p>
@@ -6591,13 +6259,7 @@
         <w:rPr>
           <w:sz w:val="24"/>
         </w:rPr>
-        <w:t>Cartório de Títulos e Documentos, nos termo</w:t>
-      </w:r>
-      <w:r>
-        <w:rPr>
-          <w:sz w:val="24"/>
-        </w:rPr>
-        <w:t>s do art. 1.361 do Código Civil.</w:t>
+        <w:t>Cartório de Títulos e Documentos, nos termos do art. 1.361 do Código Civil.</w:t>
       </w:r>
     </w:p>
     <w:p>
@@ -6828,13 +6490,7 @@
         <w:rPr>
           <w:sz w:val="24"/>
         </w:rPr>
-        <w:t>(</w:t>
-      </w:r>
-      <w:r>
-        <w:rPr>
-          <w:sz w:val="24"/>
-        </w:rPr>
-        <w:t>CNJ),</w:t>
+        <w:t>(CNJ),</w:t>
       </w:r>
       <w:r>
         <w:rPr>
@@ -7218,13 +6874,7 @@
         <w:rPr>
           <w:sz w:val="24"/>
         </w:rPr>
-        <w:t>Todos os custos, taxas, tarifas, emolumentos ou despesas decorrentes do registro, seja físico ou eletrônico, são de responsabilidade exclusiva do(a) COM</w:t>
-      </w:r>
-      <w:r>
-        <w:rPr>
-          <w:sz w:val="24"/>
-        </w:rPr>
-        <w:t>PRADOR(A), não podendo ser abatidos, compensados,</w:t>
+        <w:t>Todos os custos, taxas, tarifas, emolumentos ou despesas decorrentes do registro, seja físico ou eletrônico, são de responsabilidade exclusiva do(a) COMPRADOR(A), não podendo ser abatidos, compensados,</w:t>
       </w:r>
       <w:r>
         <w:rPr>
@@ -7889,13 +7539,7 @@
         <w:rPr>
           <w:sz w:val="24"/>
         </w:rPr>
-        <w:t>o(a</w:t>
-      </w:r>
-      <w:r>
-        <w:rPr>
-          <w:sz w:val="24"/>
-        </w:rPr>
-        <w:t>) COMPRADOR(A) responsável pelo pagamento integral do saldo devedor.</w:t>
+        <w:t>o(a) COMPRADOR(A) responsável pelo pagamento integral do saldo devedor.</w:t>
       </w:r>
     </w:p>
     <w:p>
@@ -7936,7 +7580,7 @@
                     <pic:cNvPicPr/>
                   </pic:nvPicPr>
                   <pic:blipFill>
-                    <a:blip r:embed="rId9" cstate="print"/>
+                    <a:blip r:embed="rId8" cstate="print"/>
                     <a:stretch>
                       <a:fillRect/>
                     </a:stretch>
@@ -8066,7 +7710,7 @@
           </mc:Choice>
           <mc:Fallback>
             <w:pict>
-              <v:shape w14:anchorId="491E5399" id="Graphic 18" o:spid="_x0000_s1026" style="position:absolute;margin-left:0;margin-top:0;width:595.5pt;height:842.25pt;z-index:-15857664;visibility:visible;mso-wrap-style:square;mso-wrap-distance-left:0;mso-wrap-distance-top:0;mso-wrap-distance-right:0;mso-wrap-distance-bottom:0;mso-position-horizontal:absolute;mso-position-horizontal-relative:page;mso-position-vertical:absolute;mso-position-vertical-relative:page;v-text-anchor:top" coordsize="7562850,10696575" o:gfxdata="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" path="m7562849,10696574l,10696574,,,7562849,r,10696574xe" fillcolor="#b8ddf5" stroked="f">
+              <v:shape w14:anchorId="4E0F0B45" id="Graphic 18" o:spid="_x0000_s1026" style="position:absolute;margin-left:0;margin-top:0;width:595.5pt;height:842.25pt;z-index:-15857664;visibility:visible;mso-wrap-style:square;mso-wrap-distance-left:0;mso-wrap-distance-top:0;mso-wrap-distance-right:0;mso-wrap-distance-bottom:0;mso-position-horizontal:absolute;mso-position-horizontal-relative:page;mso-position-vertical:absolute;mso-position-vertical-relative:page;v-text-anchor:top" coordsize="7562850,10696575" o:gfxdata="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" path="m7562849,10696574l,10696574,,,7562849,r,10696574xe" fillcolor="#b8ddf5" stroked="f">
                 <v:path arrowok="t"/>
                 <w10:wrap anchorx="page" anchory="page"/>
               </v:shape>
@@ -8330,7 +7974,7 @@
           </mc:Choice>
           <mc:Fallback>
             <w:pict>
-              <v:group w14:anchorId="5ECB52A1" id="Group 19" o:spid="_x0000_s1026" style="position:absolute;margin-left:12.05pt;margin-top:12.05pt;width:571.4pt;height:818.1pt;z-index:-15857152;mso-wrap-distance-left:0;mso-wrap-distance-right:0;mso-position-horizontal-relative:page;mso-position-vertical-relative:page" coordsize="72567,103898" o:gfxdata="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">
+              <v:group w14:anchorId="3C7F24C5" id="Group 19" o:spid="_x0000_s1026" style="position:absolute;margin-left:12.05pt;margin-top:12.05pt;width:571.4pt;height:818.1pt;z-index:-15857152;mso-wrap-distance-left:0;mso-wrap-distance-right:0;mso-position-horizontal-relative:page;mso-position-vertical-relative:page" coordsize="72567,103898" o:gfxdata="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">
                 <v:shape id="Graphic 20" o:spid="_x0000_s1027" style="position:absolute;width:72567;height:103898;visibility:visible;mso-wrap-style:square;v-text-anchor:top" coordsize="7256780,10389870" o:gfxdata="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" path="m6903690,10389427r-6551133,l306216,10386369r-45156,-9021l217639,10362590r-41139,-20268l138192,10316772r-34931,-30606l72655,10251235r-25551,-38309l26836,10171787r-14758,-43421l3057,10083211,,10036870,,352557,3057,306216r9021,-45156l26836,217639,47104,176500,72655,138192r30606,-34931l138192,72655,176500,47104,217639,26836,261060,12078,306216,3057,352557,,6903690,r46341,3057l6995186,12078r43421,14758l7079746,47104r38309,25551l7152985,103261r30607,34931l7209142,176500r20268,41139l7244168,261060r9021,45156l7256247,352557r,9684313l7253189,10083211r-9021,45155l7229410,10171787r-20268,41139l7183592,10251235r-30607,34931l7118055,10316772r-38309,25550l7038607,10362590r-43421,14758l6950031,10386369r-46341,3058xe" stroked="f">
                   <v:path arrowok="t"/>
                 </v:shape>
@@ -8755,13 +8399,7 @@
         <w:rPr>
           <w:sz w:val="24"/>
         </w:rPr>
-        <w:t>as medidas extrajudiciais e judi</w:t>
-      </w:r>
-      <w:r>
-        <w:rPr>
-          <w:sz w:val="24"/>
-        </w:rPr>
-        <w:t xml:space="preserve">ciais cabíveis, incluindo ação de busca e apreensão do bem descrito neste </w:t>
+        <w:t xml:space="preserve">as medidas extrajudiciais e judiciais cabíveis, incluindo ação de busca e apreensão do bem descrito neste </w:t>
       </w:r>
       <w:r>
         <w:rPr>
@@ -9410,13 +9048,7 @@
         <w:rPr>
           <w:sz w:val="24"/>
         </w:rPr>
-        <w:t>atualizadas para a formalização deste contrato, res</w:t>
-      </w:r>
-      <w:r>
-        <w:rPr>
-          <w:sz w:val="24"/>
-        </w:rPr>
-        <w:t>pondendo por qualquer inconsistência ou omissão.</w:t>
+        <w:t>atualizadas para a formalização deste contrato, respondendo por qualquer inconsistência ou omissão.</w:t>
       </w:r>
     </w:p>
     <w:p>
@@ -9582,13 +9214,7 @@
         <w:rPr>
           <w:sz w:val="24"/>
         </w:rPr>
-        <w:t>possa comprometer a integri</w:t>
-      </w:r>
-      <w:r>
-        <w:rPr>
-          <w:sz w:val="24"/>
-        </w:rPr>
-        <w:t>dade, localização ou disponibilidade do produto.</w:t>
+        <w:t>possa comprometer a integridade, localização ou disponibilidade do produto.</w:t>
       </w:r>
     </w:p>
     <w:p>
@@ -9603,7 +9229,6 @@
         </w:tabs>
         <w:spacing w:line="271" w:lineRule="auto"/>
         <w:ind w:right="551" w:firstLine="0"/>
-        <w:jc w:val="both"/>
         <w:rPr>
           <w:sz w:val="24"/>
         </w:rPr>
@@ -10791,13 +10416,7 @@
         <w:rPr>
           <w:sz w:val="24"/>
         </w:rPr>
-        <w:t>condições de pagamento, forma de aquisição e termos d</w:t>
-      </w:r>
-      <w:r>
-        <w:rPr>
-          <w:sz w:val="24"/>
-        </w:rPr>
-        <w:t>o presente contrato.</w:t>
+        <w:t>condições de pagamento, forma de aquisição e termos do presente contrato.</w:t>
       </w:r>
     </w:p>
     <w:p>
@@ -11371,13 +10990,7 @@
         <w:rPr>
           <w:sz w:val="24"/>
         </w:rPr>
-        <w:t>com</w:t>
-      </w:r>
-      <w:r>
-        <w:rPr>
-          <w:sz w:val="24"/>
-        </w:rPr>
-        <w:t>pleta</w:t>
+        <w:t>completa</w:t>
       </w:r>
       <w:r>
         <w:rPr>
@@ -11787,13 +11400,7 @@
         <w:rPr>
           <w:sz w:val="24"/>
         </w:rPr>
-        <w:t>po</w:t>
-      </w:r>
-      <w:r>
-        <w:rPr>
-          <w:sz w:val="24"/>
-        </w:rPr>
-        <w:t>steriormente</w:t>
+        <w:t>posteriormente</w:t>
       </w:r>
       <w:r>
         <w:rPr>
@@ -11865,6 +11472,7 @@
       <w:pPr>
         <w:pStyle w:val="Corpodetexto"/>
         <w:ind w:left="0"/>
+        <w:jc w:val="both"/>
         <w:rPr>
           <w:sz w:val="9"/>
         </w:rPr>
@@ -11898,7 +11506,7 @@
                     <pic:cNvPicPr/>
                   </pic:nvPicPr>
                   <pic:blipFill>
-                    <a:blip r:embed="rId9" cstate="print"/>
+                    <a:blip r:embed="rId8" cstate="print"/>
                     <a:stretch>
                       <a:fillRect/>
                     </a:stretch>
@@ -12028,7 +11636,7 @@
           </mc:Choice>
           <mc:Fallback>
             <w:pict>
-              <v:shape w14:anchorId="65827198" id="Graphic 23" o:spid="_x0000_s1026" style="position:absolute;margin-left:0;margin-top:0;width:595.5pt;height:842.25pt;z-index:-15856128;visibility:visible;mso-wrap-style:square;mso-wrap-distance-left:0;mso-wrap-distance-top:0;mso-wrap-distance-right:0;mso-wrap-distance-bottom:0;mso-position-horizontal:absolute;mso-position-horizontal-relative:page;mso-position-vertical:absolute;mso-position-vertical-relative:page;v-text-anchor:top" coordsize="7562850,10696575" o:gfxdata="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" path="m7562849,10696574l,10696574,,,7562849,r,10696574xe" fillcolor="#b8ddf5" stroked="f">
+              <v:shape w14:anchorId="0B8E637F" id="Graphic 23" o:spid="_x0000_s1026" style="position:absolute;margin-left:0;margin-top:0;width:595.5pt;height:842.25pt;z-index:-15856128;visibility:visible;mso-wrap-style:square;mso-wrap-distance-left:0;mso-wrap-distance-top:0;mso-wrap-distance-right:0;mso-wrap-distance-bottom:0;mso-position-horizontal:absolute;mso-position-horizontal-relative:page;mso-position-vertical:absolute;mso-position-vertical-relative:page;v-text-anchor:top" coordsize="7562850,10696575" o:gfxdata="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" path="m7562849,10696574l,10696574,,,7562849,r,10696574xe" fillcolor="#b8ddf5" stroked="f">
                 <v:path arrowok="t"/>
                 <w10:wrap anchorx="page" anchory="page"/>
               </v:shape>
@@ -12292,7 +11900,7 @@
           </mc:Choice>
           <mc:Fallback>
             <w:pict>
-              <v:group w14:anchorId="55951E68" id="Group 24" o:spid="_x0000_s1026" style="position:absolute;margin-left:12.05pt;margin-top:12.05pt;width:571.4pt;height:818.1pt;z-index:-15855616;mso-wrap-distance-left:0;mso-wrap-distance-right:0;mso-position-horizontal-relative:page;mso-position-vertical-relative:page" coordsize="72567,103898" o:gfxdata="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">
+              <v:group w14:anchorId="3E9FBECB" id="Group 24" o:spid="_x0000_s1026" style="position:absolute;margin-left:12.05pt;margin-top:12.05pt;width:571.4pt;height:818.1pt;z-index:-15855616;mso-wrap-distance-left:0;mso-wrap-distance-right:0;mso-position-horizontal-relative:page;mso-position-vertical-relative:page" coordsize="72567,103898" o:gfxdata="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">
                 <v:shape id="Graphic 25" o:spid="_x0000_s1027" style="position:absolute;width:72567;height:103898;visibility:visible;mso-wrap-style:square;v-text-anchor:top" coordsize="7256780,10389870" o:gfxdata="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" path="m6903690,10389427r-6551133,l306216,10386369r-45156,-9021l217639,10362590r-41139,-20268l138192,10316772r-34931,-30606l72655,10251235r-25551,-38309l26836,10171787r-14758,-43421l3057,10083211,,10036870,,352557,3057,306216r9021,-45156l26836,217639,47104,176500,72655,138192r30606,-34931l138192,72655,176500,47104,217639,26836,261060,12078,306216,3057,352557,,6903690,r46341,3057l6995186,12078r43421,14758l7079746,47104r38309,25551l7152985,103261r30607,34931l7209142,176500r20268,41139l7244168,261060r9021,45156l7256247,352557r,9684313l7253189,10083211r-9021,45155l7229410,10171787r-20268,41139l7183592,10251235r-30607,34931l7118055,10316772r-38309,25550l7038607,10362590r-43421,14758l6950031,10386369r-46341,3058xe" stroked="f">
                   <v:path arrowok="t"/>
                 </v:shape>
@@ -12764,13 +12372,7 @@
         <w:rPr>
           <w:sz w:val="24"/>
         </w:rPr>
-        <w:t>contados exclusivamente</w:t>
-      </w:r>
-      <w:r>
-        <w:rPr>
-          <w:sz w:val="24"/>
-        </w:rPr>
-        <w:t xml:space="preserve"> a partir da data da entrega do bem, conforme registrado no Termo de Entrega,</w:t>
+        <w:t>contados exclusivamente a partir da data da entrega do bem, conforme registrado no Termo de Entrega,</w:t>
       </w:r>
     </w:p>
     <w:p>
@@ -13098,13 +12700,7 @@
         <w:rPr>
           <w:sz w:val="24"/>
         </w:rPr>
-        <w:t>hipótese, danos decorrentes de mau uso, quedas, impactos, oxidação, contato com líquid</w:t>
-      </w:r>
-      <w:r>
-        <w:rPr>
-          <w:sz w:val="24"/>
-        </w:rPr>
-        <w:t>os, sobrecarga elétrica,</w:t>
+        <w:t>hipótese, danos decorrentes de mau uso, quedas, impactos, oxidação, contato com líquidos, sobrecarga elétrica,</w:t>
       </w:r>
     </w:p>
     <w:p>
@@ -13249,10 +12845,7 @@
         <w:t xml:space="preserve"> </w:t>
       </w:r>
       <w:r>
-        <w:t>d</w:t>
-      </w:r>
-      <w:r>
-        <w:t>o</w:t>
+        <w:t>do</w:t>
       </w:r>
       <w:r>
         <w:rPr>
@@ -13485,7 +13078,6 @@
         </w:tabs>
         <w:spacing w:line="271" w:lineRule="auto"/>
         <w:ind w:right="726" w:firstLine="0"/>
-        <w:jc w:val="both"/>
         <w:rPr>
           <w:sz w:val="24"/>
         </w:rPr>
@@ -13676,13 +13268,7 @@
         <w:rPr>
           <w:sz w:val="24"/>
         </w:rPr>
-        <w:t>d</w:t>
-      </w:r>
-      <w:r>
-        <w:rPr>
-          <w:sz w:val="24"/>
-        </w:rPr>
-        <w:t>e</w:t>
+        <w:t>de</w:t>
       </w:r>
       <w:r>
         <w:rPr>
@@ -14463,13 +14049,7 @@
         <w:rPr>
           <w:sz w:val="24"/>
         </w:rPr>
-        <w:t>do</w:t>
-      </w:r>
-      <w:r>
-        <w:rPr>
-          <w:sz w:val="24"/>
-        </w:rPr>
-        <w:t>(a)</w:t>
+        <w:t>do(a)</w:t>
       </w:r>
       <w:r>
         <w:rPr>
@@ -14556,10 +14136,7 @@
         <w:spacing w:line="271" w:lineRule="auto"/>
       </w:pPr>
       <w:r>
-        <w:t>inadimplênci</w:t>
-      </w:r>
-      <w:r>
-        <w:t>a;</w:t>
+        <w:t>inadimplência;</w:t>
       </w:r>
       <w:r>
         <w:rPr>
@@ -14673,7 +14250,6 @@
         </w:tabs>
         <w:spacing w:line="271" w:lineRule="auto"/>
         <w:ind w:right="940" w:firstLine="0"/>
-        <w:jc w:val="both"/>
         <w:rPr>
           <w:sz w:val="24"/>
         </w:rPr>
@@ -14983,7 +14559,6 @@
         </w:tabs>
         <w:spacing w:line="271" w:lineRule="auto"/>
         <w:ind w:right="1059" w:firstLine="0"/>
-        <w:jc w:val="both"/>
         <w:rPr>
           <w:sz w:val="24"/>
         </w:rPr>
@@ -15135,13 +14710,7 @@
         <w:rPr>
           <w:sz w:val="24"/>
         </w:rPr>
-        <w:t>dos serviços relacionados ao contr</w:t>
-      </w:r>
-      <w:r>
-        <w:rPr>
-          <w:sz w:val="24"/>
-        </w:rPr>
-        <w:t>ato, incluindo assessorias de cobrança, escritórios jurídicos, cartórios,</w:t>
+        <w:t>dos serviços relacionados ao contrato, incluindo assessorias de cobrança, escritórios jurídicos, cartórios,</w:t>
       </w:r>
     </w:p>
     <w:p>
@@ -15767,7 +15336,7 @@
                     <pic:cNvPicPr/>
                   </pic:nvPicPr>
                   <pic:blipFill>
-                    <a:blip r:embed="rId9" cstate="print"/>
+                    <a:blip r:embed="rId8" cstate="print"/>
                     <a:stretch>
                       <a:fillRect/>
                     </a:stretch>
@@ -15813,7 +15382,6 @@
         </w:tabs>
         <w:spacing w:before="30" w:line="271" w:lineRule="auto"/>
         <w:ind w:right="725" w:firstLine="0"/>
-        <w:jc w:val="both"/>
         <w:rPr>
           <w:sz w:val="24"/>
         </w:rPr>
@@ -16020,13 +15588,7 @@
         <w:rPr>
           <w:sz w:val="24"/>
         </w:rPr>
-        <w:t>prevista</w:t>
-      </w:r>
-      <w:r>
-        <w:rPr>
-          <w:sz w:val="24"/>
-        </w:rPr>
-        <w:t>s</w:t>
+        <w:t>previstas</w:t>
       </w:r>
       <w:r>
         <w:rPr>
@@ -16621,13 +16183,7 @@
         <w:rPr>
           <w:sz w:val="24"/>
         </w:rPr>
-        <w:t>condição não importará em novação, renúncia ou alteração contratual,</w:t>
-      </w:r>
-      <w:r>
-        <w:rPr>
-          <w:sz w:val="24"/>
-        </w:rPr>
-        <w:t xml:space="preserve"> constituindo mera liberalidade, que não impedirá a exigência integral e imediata das obrigações assumidas.</w:t>
+        <w:t>condição não importará em novação, renúncia ou alteração contratual, constituindo mera liberalidade, que não impedirá a exigência integral e imediata das obrigações assumidas.</w:t>
       </w:r>
     </w:p>
     <w:p>
@@ -16806,13 +16362,7 @@
         <w:rPr>
           <w:sz w:val="24"/>
         </w:rPr>
-        <w:t>demais permanecerão plenamente vigentes, obrigando as par</w:t>
-      </w:r>
-      <w:r>
-        <w:rPr>
-          <w:sz w:val="24"/>
-        </w:rPr>
-        <w:t>tes naquilo que não tiver sido atingido.</w:t>
+        <w:t>demais permanecerão plenamente vigentes, obrigando as partes naquilo que não tiver sido atingido.</w:t>
       </w:r>
     </w:p>
     <w:p>
@@ -17310,13 +16860,7 @@
         <w:rPr>
           <w:sz w:val="24"/>
         </w:rPr>
-        <w:t>expr</w:t>
-      </w:r>
-      <w:r>
-        <w:rPr>
-          <w:sz w:val="24"/>
-        </w:rPr>
-        <w:t>essa</w:t>
+        <w:t>expressa</w:t>
       </w:r>
       <w:r>
         <w:rPr>
@@ -17538,13 +17082,17 @@
         <w:t xml:space="preserve"> </w:t>
       </w:r>
       <w:r>
-        <w:t>forma, juntamente com as testemunhas abaixo, para que produza seus jurídicos e legais efeitos.</w:t>
+        <w:t xml:space="preserve">forma, </w:t>
+      </w:r>
+      <w:r>
+        <w:t>juntamente com as testemunhas abaixo, para que produza seus jurídicos e legais efeitos.</w:t>
       </w:r>
     </w:p>
     <w:p>
       <w:pPr>
         <w:pStyle w:val="Corpodetexto"/>
         <w:ind w:left="0"/>
+        <w:jc w:val="both"/>
       </w:pPr>
     </w:p>
     <w:p>
@@ -17566,7 +17114,6 @@
       <w:r>
         <w:rPr>
           <w:b/>
-          <w:color w:val="123A7C"/>
           <w:szCs w:val="22"/>
         </w:rPr>
         <w:t>{data_local_assinatura}</w:t>
@@ -17813,7 +17360,7 @@
           </mc:Choice>
           <mc:Fallback>
             <w:pict>
-              <v:shape w14:anchorId="3D05804C" id="Graphic 28" o:spid="_x0000_s1026" style="position:absolute;margin-left:0;margin-top:0;width:595.5pt;height:842.25pt;z-index:-15853568;visibility:visible;mso-wrap-style:square;mso-wrap-distance-left:0;mso-wrap-distance-top:0;mso-wrap-distance-right:0;mso-wrap-distance-bottom:0;mso-position-horizontal:absolute;mso-position-horizontal-relative:page;mso-position-vertical:absolute;mso-position-vertical-relative:page;v-text-anchor:top" coordsize="7562850,10696575" o:gfxdata="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" path="m7562849,10696574l,10696574,,,7562849,r,10696574xe" fillcolor="#b8ddf5" stroked="f">
+              <v:shape w14:anchorId="4EEB3BCD" id="Graphic 28" o:spid="_x0000_s1026" style="position:absolute;margin-left:0;margin-top:0;width:595.5pt;height:842.25pt;z-index:-15853568;visibility:visible;mso-wrap-style:square;mso-wrap-distance-left:0;mso-wrap-distance-top:0;mso-wrap-distance-right:0;mso-wrap-distance-bottom:0;mso-position-horizontal:absolute;mso-position-horizontal-relative:page;mso-position-vertical:absolute;mso-position-vertical-relative:page;v-text-anchor:top" coordsize="7562850,10696575" o:gfxdata="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" path="m7562849,10696574l,10696574,,,7562849,r,10696574xe" fillcolor="#b8ddf5" stroked="f">
                 <v:path arrowok="t"/>
                 <w10:wrap anchorx="page" anchory="page"/>
               </v:shape>
@@ -18077,7 +17624,7 @@
           </mc:Choice>
           <mc:Fallback>
             <w:pict>
-              <v:group w14:anchorId="311CD818" id="Group 29" o:spid="_x0000_s1026" style="position:absolute;margin-left:12.05pt;margin-top:12.05pt;width:571.4pt;height:818.1pt;z-index:-15853056;mso-wrap-distance-left:0;mso-wrap-distance-right:0;mso-position-horizontal-relative:page;mso-position-vertical-relative:page" coordsize="72567,103898" o:gfxdata="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">
+              <v:group w14:anchorId="3DFAB6C0" id="Group 29" o:spid="_x0000_s1026" style="position:absolute;margin-left:12.05pt;margin-top:12.05pt;width:571.4pt;height:818.1pt;z-index:-15853056;mso-wrap-distance-left:0;mso-wrap-distance-right:0;mso-position-horizontal-relative:page;mso-position-vertical-relative:page" coordsize="72567,103898" o:gfxdata="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">
                 <v:shape id="Graphic 30" o:spid="_x0000_s1027" style="position:absolute;width:72567;height:103898;visibility:visible;mso-wrap-style:square;v-text-anchor:top" coordsize="7256780,10389870" o:gfxdata="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" path="m6903690,10389427r-6551133,l306216,10386369r-45156,-9021l217639,10362590r-41139,-20268l138192,10316772r-34931,-30606l72655,10251235r-25551,-38309l26836,10171787r-14758,-43421l3057,10083211,,10036870,,352557,3057,306216r9021,-45156l26836,217639,47104,176500,72655,138192r30606,-34931l138192,72655,176500,47104,217639,26836,261060,12078,306216,3057,352557,,6903690,r46341,3057l6995186,12078r43421,14758l7079746,47104r38309,25551l7152985,103261r30607,34931l7209142,176500r20268,41139l7244168,261060r9021,45156l7256247,352557r,9684313l7253189,10083211r-9021,45155l7229410,10171787r-20268,41139l7183592,10251235r-30607,34931l7118055,10316772r-38309,25550l7038607,10362590r-43421,14758l6950031,10386369r-46341,3058xe" stroked="f">
                   <v:path arrowok="t"/>
                 </v:shape>
@@ -18224,7 +17771,7 @@
           </mc:Choice>
           <mc:Fallback>
             <w:pict>
-              <v:group w14:anchorId="12F8B4A7" id="Group 32" o:spid="_x0000_s1026" style="width:137.55pt;height:.8pt;mso-position-horizontal-relative:char;mso-position-vertical-relative:line" coordsize="17468,101" o:gfxdata="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">
+              <v:group w14:anchorId="432F2674" id="Group 32" o:spid="_x0000_s1026" style="width:137.55pt;height:.8pt;mso-position-horizontal-relative:char;mso-position-vertical-relative:line" coordsize="17468,101" o:gfxdata="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">
                 <v:shape id="Graphic 33" o:spid="_x0000_s1027" style="position:absolute;top:49;width:17468;height:13;visibility:visible;mso-wrap-style:square;v-text-anchor:top" coordsize="1746885,1270" o:gfxdata="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" path="m,l1746412,e" filled="f" strokeweight=".27525mm">
                   <v:path arrowok="t"/>
                 </v:shape>
@@ -18316,7 +17863,7 @@
           </mc:Choice>
           <mc:Fallback>
             <w:pict>
-              <v:group w14:anchorId="12CDA6DB" id="Group 34" o:spid="_x0000_s1026" style="width:137.55pt;height:.8pt;mso-position-horizontal-relative:char;mso-position-vertical-relative:line" coordsize="17468,101" o:gfxdata="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">
+              <v:group w14:anchorId="79636717" id="Group 34" o:spid="_x0000_s1026" style="width:137.55pt;height:.8pt;mso-position-horizontal-relative:char;mso-position-vertical-relative:line" coordsize="17468,101" o:gfxdata="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">
                 <v:shape id="Graphic 35" o:spid="_x0000_s1027" style="position:absolute;top:49;width:17468;height:13;visibility:visible;mso-wrap-style:square;v-text-anchor:top" coordsize="1746885,1270" o:gfxdata="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" path="m,l1746412,e" filled="f" strokeweight=".27525mm">
                   <v:path arrowok="t"/>
                 </v:shape>
@@ -18406,7 +17953,7 @@
                           <pic:cNvPicPr/>
                         </pic:nvPicPr>
                         <pic:blipFill>
-                          <a:blip r:embed="rId10" cstate="print"/>
+                          <a:blip r:embed="rId9" cstate="print"/>
                           <a:stretch>
                             <a:fillRect/>
                           </a:stretch>
@@ -18427,7 +17974,7 @@
                           <pic:cNvPicPr/>
                         </pic:nvPicPr>
                         <pic:blipFill>
-                          <a:blip r:embed="rId11" cstate="print"/>
+                          <a:blip r:embed="rId10" cstate="print"/>
                           <a:stretch>
                             <a:fillRect/>
                           </a:stretch>
@@ -18450,12 +17997,12 @@
           </mc:Choice>
           <mc:Fallback>
             <w:pict>
-              <v:group w14:anchorId="6FB70C53" id="Group 36" o:spid="_x0000_s1026" style="position:absolute;margin-left:204.25pt;margin-top:18.7pt;width:164.2pt;height:47.6pt;z-index:-15718912;mso-wrap-distance-left:0;mso-wrap-distance-right:0;mso-position-horizontal-relative:page" coordsize="20853,6045" o:gfxdata="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">
+              <v:group w14:anchorId="1F21A720" id="Group 36" o:spid="_x0000_s1026" style="position:absolute;margin-left:204.25pt;margin-top:18.7pt;width:164.2pt;height:47.6pt;z-index:-15718912;mso-wrap-distance-left:0;mso-wrap-distance-right:0;mso-position-horizontal-relative:page" coordsize="20853,6045" o:gfxdata="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">
                 <v:shape id="Image 37" o:spid="_x0000_s1027" type="#_x0000_t75" style="position:absolute;left:14844;width:6003;height:6003;visibility:visible;mso-wrap-style:square" o:gfxdata="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">
-                  <v:imagedata r:id="rId12" o:title=""/>
+                  <v:imagedata r:id="rId11" o:title=""/>
                 </v:shape>
                 <v:shape id="Image 38" o:spid="_x0000_s1028" type="#_x0000_t75" style="position:absolute;top:1184;width:16675;height:4860;visibility:visible;mso-wrap-style:square" o:gfxdata="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">
-                  <v:imagedata r:id="rId13" o:title=""/>
+                  <v:imagedata r:id="rId12" o:title=""/>
                 </v:shape>
                 <w10:wrap type="topAndBottom" anchorx="page"/>
               </v:group>
@@ -18478,7 +18025,7 @@
 <w:numbering xmlns:wpc="http://schemas.microsoft.com/office/word/2010/wordprocessingCanvas" xmlns:cx="http://schemas.microsoft.com/office/drawing/2014/chartex" xmlns:cx1="http://schemas.microsoft.com/office/drawing/2015/9/8/chartex" xmlns:cx2="http://schemas.microsoft.com/office/drawing/2015/10/21/chartex" xmlns:cx3="http://schemas.microsoft.com/office/drawing/2016/5/9/chartex" xmlns:cx4="http://schemas.microsoft.com/office/drawing/2016/5/10/chartex" xmlns:cx5="http://schemas.microsoft.com/office/drawing/2016/5/11/chartex" xmlns:cx6="http://schemas.microsoft.com/office/drawing/2016/5/12/chartex" xmlns:cx7="http://schemas.microsoft.com/office/drawing/2016/5/13/chartex" xmlns:cx8="http://schemas.microsoft.com/office/drawing/2016/5/14/chartex" xmlns:mc="http://schemas.openxmlformats.org/markup-compatibility/2006" xmlns:aink="http://schemas.microsoft.com/office/drawing/2016/ink" xmlns:am3d="http://schemas.microsoft.com/office/drawing/2017/model3d" xmlns:o="urn:schemas-microsoft-com:office:office" xmlns:r="http://schemas.openxmlformats.org/officeDocument/2006/relationships" xmlns:m="http://schemas.openxmlformats.org/officeDocument/2006/math" xmlns:v="urn:schemas-microsoft-com:vml" xmlns:wp14="http://schemas.microsoft.com/office/word/2010/wordprocessingDrawing" xmlns:wp="http://schemas.openxmlformats.org/drawingml/2006/wordprocessingDrawing" xmlns:w10="urn:schemas-microsoft-com:office:word" xmlns:w="http://schemas.openxmlformats.org/wordprocessingml/2006/main" xmlns:w14="http://schemas.microsoft.com/office/word/2010/wordml" xmlns:w15="http://schemas.microsoft.com/office/word/2012/wordml" xmlns:w16cex="http://schemas.microsoft.com/office/word/2018/wordml/cex" xmlns:w16cid="http://schemas.microsoft.com/office/word/2016/wordml/cid" xmlns:w16="http://schemas.microsoft.com/office/word/2018/wordml" xmlns:w16sdtdh="http://schemas.microsoft.com/office/word/2020/wordml/sdtdatahash" xmlns:w16se="http://schemas.microsoft.com/office/word/2015/wordml/symex" xmlns:wpg="http://schemas.microsoft.com/office/word/2010/wordprocessingGroup" xmlns:wpi="http://schemas.microsoft.com/office/word/2010/wordprocessingInk" xmlns:wne="http://schemas.microsoft.com/office/word/2006/wordml" xmlns:wps="http://schemas.microsoft.com/office/word/2010/wordprocessingShape" mc:Ignorable="w14 w15 w16se w16cid w16 w16cex w16sdtdh wp14">
   <w:numPicBullet w:numPicBulletId="0">
     <w:pict>
-      <v:shapetype w14:anchorId="2C8392E6" id="_x0000_t75" coordsize="21600,21600" o:spt="75" o:preferrelative="t" path="m@4@5l@4@11@9@11@9@5xe" filled="f" stroked="f">
+      <v:shapetype w14:anchorId="561C2A8A" id="_x0000_t75" coordsize="21600,21600" o:spt="75" o:preferrelative="t" path="m@4@5l@4@11@9@11@9@5xe" filled="f" stroked="f">
         <v:stroke joinstyle="miter"/>
         <v:formulas>
           <v:f eqn="if lineDrawn pixelLineWidth 0"/>
@@ -18497,7 +18044,7 @@
         <v:path o:extrusionok="f" gradientshapeok="t" o:connecttype="rect"/>
         <o:lock v:ext="edit" aspectratio="t"/>
       </v:shapetype>
-      <v:shape id="_x0000_i1114" type="#_x0000_t75" style="width:5.85pt;height:5.85pt" o:bullet="t">
+      <v:shape id="_x0000_i1043" type="#_x0000_t75" style="width:6pt;height:6pt" o:bullet="t">
         <v:imagedata r:id="rId1" o:title="image3"/>
       </v:shape>
     </w:pict>
@@ -18513,7 +18060,6 @@
       <w:lvlJc w:val="left"/>
       <w:pPr>
         <w:ind w:left="76" w:hanging="427"/>
-        <w:jc w:val="left"/>
       </w:pPr>
       <w:rPr>
         <w:rFonts w:hint="default"/>
@@ -18527,7 +18073,6 @@
       <w:lvlJc w:val="left"/>
       <w:pPr>
         <w:ind w:left="76" w:hanging="427"/>
-        <w:jc w:val="left"/>
       </w:pPr>
       <w:rPr>
         <w:rFonts w:ascii="Calibri" w:eastAsia="Calibri" w:hAnsi="Calibri" w:cs="Calibri" w:hint="default"/>
@@ -18638,7 +18183,6 @@
       <w:lvlJc w:val="left"/>
       <w:pPr>
         <w:ind w:left="76" w:hanging="426"/>
-        <w:jc w:val="left"/>
       </w:pPr>
       <w:rPr>
         <w:rFonts w:hint="default"/>
@@ -18652,7 +18196,6 @@
       <w:lvlJc w:val="left"/>
       <w:pPr>
         <w:ind w:left="76" w:hanging="426"/>
-        <w:jc w:val="left"/>
       </w:pPr>
       <w:rPr>
         <w:rFonts w:ascii="Calibri" w:eastAsia="Calibri" w:hAnsi="Calibri" w:cs="Calibri" w:hint="default"/>
@@ -18763,7 +18306,6 @@
       <w:lvlJc w:val="left"/>
       <w:pPr>
         <w:ind w:left="76" w:hanging="427"/>
-        <w:jc w:val="left"/>
       </w:pPr>
       <w:rPr>
         <w:rFonts w:hint="default"/>
@@ -18777,7 +18319,6 @@
       <w:lvlJc w:val="left"/>
       <w:pPr>
         <w:ind w:left="76" w:hanging="427"/>
-        <w:jc w:val="left"/>
       </w:pPr>
       <w:rPr>
         <w:rFonts w:ascii="Calibri" w:eastAsia="Calibri" w:hAnsi="Calibri" w:cs="Calibri" w:hint="default"/>
@@ -18888,7 +18429,6 @@
       <w:lvlJc w:val="left"/>
       <w:pPr>
         <w:ind w:left="76" w:hanging="426"/>
-        <w:jc w:val="left"/>
       </w:pPr>
       <w:rPr>
         <w:rFonts w:hint="default"/>
@@ -18902,7 +18442,6 @@
       <w:lvlJc w:val="left"/>
       <w:pPr>
         <w:ind w:left="76" w:hanging="426"/>
-        <w:jc w:val="left"/>
       </w:pPr>
       <w:rPr>
         <w:rFonts w:ascii="Calibri" w:eastAsia="Calibri" w:hAnsi="Calibri" w:cs="Calibri" w:hint="default"/>
@@ -19013,7 +18552,6 @@
       <w:lvlJc w:val="left"/>
       <w:pPr>
         <w:ind w:left="66" w:hanging="481"/>
-        <w:jc w:val="left"/>
       </w:pPr>
       <w:rPr>
         <w:rFonts w:hint="default"/>
@@ -19027,7 +18565,6 @@
       <w:lvlJc w:val="left"/>
       <w:pPr>
         <w:ind w:left="66" w:hanging="481"/>
-        <w:jc w:val="left"/>
       </w:pPr>
       <w:rPr>
         <w:rFonts w:ascii="Calibri" w:eastAsia="Calibri" w:hAnsi="Calibri" w:cs="Calibri" w:hint="default"/>
@@ -19138,7 +18675,6 @@
       <w:lvlJc w:val="left"/>
       <w:pPr>
         <w:ind w:left="76" w:hanging="548"/>
-        <w:jc w:val="left"/>
       </w:pPr>
       <w:rPr>
         <w:rFonts w:hint="default"/>
@@ -19152,7 +18688,6 @@
       <w:lvlJc w:val="left"/>
       <w:pPr>
         <w:ind w:left="76" w:hanging="548"/>
-        <w:jc w:val="left"/>
       </w:pPr>
       <w:rPr>
         <w:rFonts w:ascii="Calibri" w:eastAsia="Calibri" w:hAnsi="Calibri" w:cs="Calibri" w:hint="default"/>
@@ -19263,7 +18798,6 @@
       <w:lvlJc w:val="left"/>
       <w:pPr>
         <w:ind w:left="76" w:hanging="427"/>
-        <w:jc w:val="left"/>
       </w:pPr>
       <w:rPr>
         <w:rFonts w:hint="default"/>
@@ -19277,7 +18811,6 @@
       <w:lvlJc w:val="left"/>
       <w:pPr>
         <w:ind w:left="76" w:hanging="427"/>
-        <w:jc w:val="left"/>
       </w:pPr>
       <w:rPr>
         <w:rFonts w:ascii="Calibri" w:eastAsia="Calibri" w:hAnsi="Calibri" w:cs="Calibri" w:hint="default"/>
@@ -19388,7 +18921,6 @@
       <w:lvlJc w:val="left"/>
       <w:pPr>
         <w:ind w:left="76" w:hanging="426"/>
-        <w:jc w:val="left"/>
       </w:pPr>
       <w:rPr>
         <w:rFonts w:hint="default"/>
@@ -19402,7 +18934,6 @@
       <w:lvlJc w:val="left"/>
       <w:pPr>
         <w:ind w:left="76" w:hanging="426"/>
-        <w:jc w:val="left"/>
       </w:pPr>
       <w:rPr>
         <w:rFonts w:ascii="Calibri" w:eastAsia="Calibri" w:hAnsi="Calibri" w:cs="Calibri" w:hint="default"/>
@@ -19513,7 +19044,6 @@
       <w:lvlJc w:val="left"/>
       <w:pPr>
         <w:ind w:left="66" w:hanging="426"/>
-        <w:jc w:val="left"/>
       </w:pPr>
       <w:rPr>
         <w:rFonts w:hint="default"/>
@@ -19527,7 +19057,6 @@
       <w:lvlJc w:val="left"/>
       <w:pPr>
         <w:ind w:left="66" w:hanging="426"/>
-        <w:jc w:val="left"/>
       </w:pPr>
       <w:rPr>
         <w:rFonts w:ascii="Calibri" w:eastAsia="Calibri" w:hAnsi="Calibri" w:cs="Calibri" w:hint="default"/>
@@ -19549,7 +19078,6 @@
       <w:lvlJc w:val="left"/>
       <w:pPr>
         <w:ind w:left="1085" w:hanging="612"/>
-        <w:jc w:val="left"/>
       </w:pPr>
       <w:rPr>
         <w:rFonts w:ascii="Calibri" w:eastAsia="Calibri" w:hAnsi="Calibri" w:cs="Calibri" w:hint="default"/>
@@ -19648,7 +19176,6 @@
       <w:lvlJc w:val="left"/>
       <w:pPr>
         <w:ind w:left="76" w:hanging="427"/>
-        <w:jc w:val="left"/>
       </w:pPr>
       <w:rPr>
         <w:rFonts w:hint="default"/>
@@ -19662,7 +19189,6 @@
       <w:lvlJc w:val="left"/>
       <w:pPr>
         <w:ind w:left="76" w:hanging="427"/>
-        <w:jc w:val="left"/>
       </w:pPr>
       <w:rPr>
         <w:rFonts w:ascii="Calibri" w:eastAsia="Calibri" w:hAnsi="Calibri" w:cs="Calibri" w:hint="default"/>
@@ -19895,7 +19421,6 @@
       <w:lvlJc w:val="left"/>
       <w:pPr>
         <w:ind w:left="76" w:hanging="548"/>
-        <w:jc w:val="left"/>
       </w:pPr>
       <w:rPr>
         <w:rFonts w:hint="default"/>
@@ -19909,7 +19434,6 @@
       <w:lvlJc w:val="left"/>
       <w:pPr>
         <w:ind w:left="76" w:hanging="548"/>
-        <w:jc w:val="left"/>
       </w:pPr>
       <w:rPr>
         <w:rFonts w:ascii="Calibri" w:eastAsia="Calibri" w:hAnsi="Calibri" w:cs="Calibri" w:hint="default"/>

</xml_diff>